<commit_message>
Neutralize MCMOD body tone for third-person style
</commit_message>
<xml_diff>
--- a/docs/mcmod-body-richtext.docx
+++ b/docs/mcmod-body-richtext.docx
@@ -72,7 +72,7 @@
           <w:rFonts w:ascii="Microsoft YaHei" w:hAnsi="Microsoft YaHei" w:eastAsia="Microsoft YaHei"/>
           <w:sz w:val="22"/>
         </w:rPr>
-        <w:t>它解决的问题很简单：打字机激活后，按下绑定的按键应该只发送无线红石频率，而不应该打开其他模组的背包、地图、任务书或设置界面。</w:t>
+        <w:t>本模组用于解决以下问题：打字机激活后，按下绑定的按键应只发送无线红石频率，而不应打开其他模组的背包、地图、任务书或设置界面。</w:t>
       </w:r>
     </w:p>
     <w:p>
@@ -779,7 +779,7 @@
           <w:rFonts w:ascii="Microsoft YaHei" w:hAnsi="Microsoft YaHei" w:eastAsia="Microsoft YaHei"/>
           <w:sz w:val="22"/>
         </w:rPr>
-        <w:t>如果某个模组直接通过 GLFW 轮询物理按键，而不经过按键映射或 NeoForge 按键事件，该模组仍可能看到按键。绝大多数快捷键模组使用标准路径，已被覆盖。</w:t>
+        <w:t>如果某个模组直接通过 GLFW 轮询物理按键，而不经过按键映射或 NeoForge 按键事件，该模组仍可能看到按键。常见快捷键模组通常使用标准路径，本模组已覆盖这些情况。</w:t>
       </w:r>
     </w:p>
     <w:p>
@@ -1004,7 +1004,7 @@
           <w:color w:val="1F4E79"/>
           <w:sz w:val="28"/>
         </w:rPr>
-        <w:t>十二、关于维护</w:t>
+        <w:t>十二、维护说明</w:t>
       </w:r>
     </w:p>
     <w:p>
@@ -1016,7 +1016,7 @@
           <w:rFonts w:ascii="Microsoft YaHei" w:hAnsi="Microsoft YaHei" w:eastAsia="Microsoft YaHei"/>
           <w:sz w:val="22"/>
         </w:rPr>
-        <w:t>作者本人没有代码能力，对模组的维护能力也有限。这个模组只是解决作者个人遇到的一个小问题；公开发布只是希望顺便便利其他用户。如果无法公开，作者也会继续自用。</w:t>
+        <w:t>本模组由个人开发，功能范围有限，更新频率可能较低。发布目的是为遇到同类按键冲突问题的玩家提供一个可用的解决方案。</w:t>
       </w:r>
     </w:p>
     <w:p>
@@ -1129,7 +1129,7 @@
           <w:rFonts w:ascii="Microsoft YaHei" w:hAnsi="Microsoft YaHei" w:eastAsia="Microsoft YaHei"/>
           <w:sz w:val="22"/>
         </w:rPr>
-        <w:t>感谢 Simulated Team 的 Create: Aeronautics 与无线红石打字机。</w:t>
+        <w:t>致谢：Simulated Team 的 Create: Aeronautics 与无线红石打字机。</w:t>
       </w:r>
     </w:p>
     <w:sectPr>

</xml_diff>

<commit_message>
Add AI usage declaration to MCMOD body
</commit_message>
<xml_diff>
--- a/docs/mcmod-body-richtext.docx
+++ b/docs/mcmod-body-richtext.docx
@@ -73,6 +73,26 @@
           <w:sz w:val="22"/>
         </w:rPr>
         <w:t>本模组用于解决以下问题：打字机激活后，按下绑定的按键应只发送无线红石频率，而不应打开其他模组的背包、地图、任务书或设置界面。</w:t>
+      </w:r>
+    </w:p>
+    <w:p>
+      <w:pPr>
+        <w:spacing w:after="120"/>
+      </w:pPr>
+      <w:r>
+        <w:rPr>
+          <w:rFonts w:ascii="Microsoft YaHei" w:hAnsi="Microsoft YaHei" w:eastAsia="Microsoft YaHei"/>
+          <w:b/>
+          <w:sz w:val="22"/>
+        </w:rPr>
+        <w:t>AI 使用声明：</w:t>
+      </w:r>
+      <w:r>
+        <w:rPr>
+          <w:rFonts w:ascii="Microsoft YaHei" w:hAnsi="Microsoft YaHei" w:eastAsia="Microsoft YaHei"/>
+          <w:sz w:val="22"/>
+        </w:rPr>
+        <w:t>本模组的 Java 代码与中英文文档在开发过程中使用了生成式 AI 辅助生成，并由作者进行人工测试、审查和修改。模组运行时不调用生成式 AI，也不包含 AI 生成的游戏内纹理、模型或音效。项目图标由游戏内截图与蓝图背景合成，不属于生成式 AI 图像。</w:t>
       </w:r>
     </w:p>
     <w:p>

</xml_diff>